<commit_message>
CV (6yrs version): remove job company/date line and earlier experience
Co-Authored-By: Claude Opus 5.5 <noreply@anthropic.com>
Claude-Session: https://claude.ai/code/session_01CMn8zBKDwWijX1DHa9YA5f
</commit_message>
<xml_diff>
--- a/cv/Sidharth_K_CV_6yrs.docx
+++ b/cv/Sidharth_K_CV_6yrs.docx
@@ -268,7 +268,7 @@
     </w:p>
     <w:p>
       <w:pPr>
-        <w:spacing w:after="0" w:before="80"/>
+        <w:spacing w:after="40" w:before="80"/>
       </w:pPr>
       <w:r>
         <w:rPr>
@@ -277,18 +277,6 @@
           <w:sz w:val="22"/>
         </w:rPr>
         <w:t>Application Developer</w:t>
-      </w:r>
-    </w:p>
-    <w:p>
-      <w:pPr>
-        <w:spacing w:after="40" w:before="0"/>
-      </w:pPr>
-      <w:r>
-        <w:rPr>
-          <w:b w:val="0"/>
-          <w:i/>
-        </w:rPr>
-        <w:t>Amplitude Software System | Mar 2023 - Present</w:t>
       </w:r>
     </w:p>
     <w:p>
@@ -370,31 +358,6 @@
       </w:pPr>
       <w:r>
         <w:t>Provided IT support to international clients for 3+ months, diagnosing and resolving technical issues under high-pressure conditions.</w:t>
-      </w:r>
-    </w:p>
-    <w:p>
-      <w:pPr>
-        <w:spacing w:after="0" w:before="80"/>
-      </w:pPr>
-      <w:r>
-        <w:rPr>
-          <w:b/>
-          <w:i w:val="0"/>
-          <w:sz w:val="22"/>
-        </w:rPr>
-        <w:t>Earlier Experience</w:t>
-      </w:r>
-    </w:p>
-    <w:p>
-      <w:pPr>
-        <w:spacing w:after="0" w:before="0"/>
-      </w:pPr>
-      <w:r>
-        <w:rPr>
-          <w:b w:val="0"/>
-          <w:i w:val="0"/>
-        </w:rPr>
-        <w:t>IT Technician, Access Computers | Mar 2021 - Feb 2023: hardware, networking, and system support for business and individual clients.</w:t>
       </w:r>
     </w:p>
     <w:p>

</xml_diff>